<commit_message>
Update ASCO documents for PBO approval and October 2026 developments
</commit_message>
<xml_diff>
--- a/Governance Documents/ASCO Board Charter 2026.docx
+++ b/Governance Documents/ASCO Board Charter 2026.docx
@@ -1751,6 +1751,12 @@
           <w:sz w:val="20"/>
         </w:rPr>
         <w:t>This Board Charter was adopted by the Board of Directors of African Solidarity Civic Organisation (ASCO).</w:t>
+      </w:r>
+    </w:p>
+    <w:p>
+      <w:r>
+        <w:t>15. SENIOR NON-DIRECTOR LEADERSHIP
+The Board remains composed of exactly four Directors. The following senior leadership positions are non-director positions and do not amend the MOI or CIPC Board: Treasurer &amp; Finance Officer; Head of Programmes &amp; Community Development; and Head of Partnerships, Gender &amp; Inclusion — VACANT. All positions remain subject to Board-approved delegation, policies and accountability.</w:t>
       </w:r>
     </w:p>
     <w:p>

</xml_diff>

<commit_message>
Correct named non-director senior management roster
</commit_message>
<xml_diff>
--- a/Governance Documents/ASCO Board Charter 2026.docx
+++ b/Governance Documents/ASCO Board Charter 2026.docx
@@ -1755,8 +1755,12 @@
     </w:p>
     <w:p>
       <w:r>
-        <w:t>15. SENIOR NON-DIRECTOR LEADERSHIP
-The Board remains composed of exactly four Directors. The following senior leadership positions are non-director positions and do not amend the MOI or CIPC Board: Treasurer &amp; Finance Officer; Head of Programmes &amp; Community Development; and Head of Partnerships, Gender &amp; Inclusion — VACANT. All positions remain subject to Board-approved delegation, policies and accountability.</w:t>
+        <w:rPr>
+          <w:sz w:val="17"/>
+        </w:rPr>
+        <w:t>15. SENIOR NON-DIRECTOR LEADERSHIP</w:t>
+        <w:br/>
+        <w:t>The Board has exactly four Directors. The following are non-director senior-management roles and do not amend the MOI or CIPC records: Treasurer &amp; Finance Officer; Ms Angel Nokukhanya Gumede — Head of Humanitarian Affairs &amp; Emergency Response; Ms Thando Mathe — Head of Social Protection, Inclusion &amp; Safeguarding; and Mr Maguqu Meshack Mzimela — Head of Programmes, Research &amp; Strategic Partnerships. All roles operate under Board-approved delegation, policies and accountability.</w:t>
       </w:r>
     </w:p>
     <w:p>
@@ -1918,7 +1922,7 @@
                 <w:b/>
                 <w:bCs/>
               </w:rPr>
-              <w:t>6 September 2026</w:t>
+              <w:t>2 October 2026</w:t>
             </w:r>
             <w:r>
               <w:br/>
@@ -2041,7 +2045,7 @@
                 <w:b/>
                 <w:bCs/>
               </w:rPr>
-              <w:t>6 September 2026</w:t>
+              <w:t>2 October 2026</w:t>
             </w:r>
             <w:r>
               <w:br/>
@@ -2173,7 +2177,7 @@
                 <w:b/>
                 <w:bCs/>
               </w:rPr>
-              <w:t>6 September 2026</w:t>
+              <w:t>2 October 2026</w:t>
             </w:r>
             <w:r>
               <w:br/>
@@ -2299,7 +2303,7 @@
                 <w:b/>
                 <w:bCs/>
               </w:rPr>
-              <w:t>6 September 2026</w:t>
+              <w:t>2 October 2026</w:t>
             </w:r>
             <w:r>
               <w:br/>

</xml_diff>